<commit_message>
test du changement simultané du word avec ludi
</commit_message>
<xml_diff>
--- a/Rendu1.docx
+++ b/Rendu1.docx
@@ -4,15 +4,12 @@
   <w:body>
     <w:p>
       <w:r>
-        <w:t xml:space="preserve">Et </w:t>
+        <w:t>Et la ????</w:t>
       </w:r>
-      <w:proofErr w:type="gramStart"/>
+    </w:p>
+    <w:p>
       <w:r>
-        <w:t>la</w:t>
-      </w:r>
-      <w:proofErr w:type="gramEnd"/>
-      <w:r>
-        <w:t> ????</w:t>
+        <w:t>Je modifie de mon coté : Sophie et Eli vont lâcher une masterchiasse sur ce projet je sens.</w:t>
       </w:r>
     </w:p>
     <w:sectPr>

</xml_diff>